<commit_message>
refine(publication-reward): drop +/- column, inline external list
- Two-column summary table (รายการ | จำนวนเงิน); the subtract is conveyed by
  the red accounting parentheses on (C) and the 'A + B - C' top-up label, so the
  dedicated +/- column was redundant.
- Inline {{external_fund_list}} into the (C) label paragraph so an empty list no
  longer leaves a dangling blank line in the cell.
</commit_message>
<xml_diff>
--- a/templates/publication_reward_template_new.docx
+++ b/templates/publication_reward_template_new.docx
@@ -1120,7 +1120,7 @@
     </w:p>
     <w:tbl>
       <w:tblPr>
-        <w:tblW w:w="9450" w:type="dxa"/>
+        <w:tblW w:w="9500" w:type="dxa"/>
         <w:jc w:val="center"/>
         <w:tblBorders>
           <w:top w:val="single" w:sz="8" w:space="0" w:color="000000"/>
@@ -1135,14 +1135,13 @@
         </w:tblCellMar>
       </w:tblPr>
       <w:tblGrid>
-        <w:gridCol w:w="5850"/>
-        <w:gridCol w:w="1100"/>
-        <w:gridCol w:w="2500"/>
+        <w:gridCol w:w="6900"/>
+        <w:gridCol w:w="2600"/>
       </w:tblGrid>
       <w:tr>
         <w:tc>
           <w:tcPr>
-            <w:tcW w:w="5850" w:type="dxa"/>
+            <w:tcW w:w="6900" w:type="dxa"/>
             <w:vAlign w:val="center"/>
           </w:tcPr>
           <w:p>
@@ -1166,30 +1165,7 @@
         </w:tc>
         <w:tc>
           <w:tcPr>
-            <w:tcW w:w="1100" w:type="dxa"/>
-            <w:vAlign w:val="center"/>
-          </w:tcPr>
-          <w:p>
-            <w:pPr>
-              <w:spacing w:before="30" w:after="30" w:line="240" w:lineRule="auto"/>
-              <w:ind w:right="0"/>
-              <w:jc w:val="center"/>
-            </w:pPr>
-            <w:r>
-              <w:rPr>
-                <w:rFonts w:ascii="TH Sarabun New" w:hAnsi="TH Sarabun New" w:cs="TH Sarabun New"/>
-                <w:b/>
-                <w:bCs/>
-                <w:sz w:val="28"/>
-                <w:szCs w:val="28"/>
-              </w:rPr>
-              <w:t xml:space="preserve">+/-</w:t>
-            </w:r>
-          </w:p>
-        </w:tc>
-        <w:tc>
-          <w:tcPr>
-            <w:tcW w:w="2500" w:type="dxa"/>
+            <w:tcW w:w="2600" w:type="dxa"/>
             <w:vAlign w:val="center"/>
           </w:tcPr>
           <w:p>
@@ -1215,7 +1191,7 @@
       <w:tr>
         <w:tc>
           <w:tcPr>
-            <w:tcW w:w="5850" w:type="dxa"/>
+            <w:tcW w:w="6900" w:type="dxa"/>
             <w:vAlign w:val="center"/>
           </w:tcPr>
           <w:p>
@@ -1237,31 +1213,7 @@
         </w:tc>
         <w:tc>
           <w:tcPr>
-            <w:tcW w:w="1100" w:type="dxa"/>
-            <w:vAlign w:val="center"/>
-          </w:tcPr>
-          <w:p>
-            <w:pPr>
-              <w:spacing w:before="30" w:after="30" w:line="240" w:lineRule="auto"/>
-              <w:ind w:right="0"/>
-              <w:jc w:val="center"/>
-            </w:pPr>
-            <w:r>
-              <w:rPr>
-                <w:rFonts w:ascii="TH Sarabun New" w:hAnsi="TH Sarabun New" w:cs="TH Sarabun New"/>
-                <w:b/>
-                <w:bCs/>
-                <w:color w:val="1F9D57"/>
-                <w:sz w:val="28"/>
-                <w:szCs w:val="28"/>
-              </w:rPr>
-              <w:t xml:space="preserve">+</w:t>
-            </w:r>
-          </w:p>
-        </w:tc>
-        <w:tc>
-          <w:tcPr>
-            <w:tcW w:w="2500" w:type="dxa"/>
+            <w:tcW w:w="2600" w:type="dxa"/>
             <w:vAlign w:val="center"/>
           </w:tcPr>
           <w:p>
@@ -1293,7 +1245,7 @@
       <w:tr>
         <w:tc>
           <w:tcPr>
-            <w:tcW w:w="5850" w:type="dxa"/>
+            <w:tcW w:w="6900" w:type="dxa"/>
             <w:vAlign w:val="center"/>
           </w:tcPr>
           <w:p>
@@ -1315,31 +1267,7 @@
         </w:tc>
         <w:tc>
           <w:tcPr>
-            <w:tcW w:w="1100" w:type="dxa"/>
-            <w:vAlign w:val="center"/>
-          </w:tcPr>
-          <w:p>
-            <w:pPr>
-              <w:spacing w:before="30" w:after="30" w:line="240" w:lineRule="auto"/>
-              <w:ind w:right="0"/>
-              <w:jc w:val="center"/>
-            </w:pPr>
-            <w:r>
-              <w:rPr>
-                <w:rFonts w:ascii="TH Sarabun New" w:hAnsi="TH Sarabun New" w:cs="TH Sarabun New"/>
-                <w:b/>
-                <w:bCs/>
-                <w:color w:val="1F9D57"/>
-                <w:sz w:val="28"/>
-                <w:szCs w:val="28"/>
-              </w:rPr>
-              <w:t xml:space="preserve">+</w:t>
-            </w:r>
-          </w:p>
-        </w:tc>
-        <w:tc>
-          <w:tcPr>
-            <w:tcW w:w="2500" w:type="dxa"/>
+            <w:tcW w:w="2600" w:type="dxa"/>
             <w:vAlign w:val="center"/>
           </w:tcPr>
           <w:p>
@@ -1371,7 +1299,7 @@
       <w:tr>
         <w:tc>
           <w:tcPr>
-            <w:tcW w:w="5850" w:type="dxa"/>
+            <w:tcW w:w="6900" w:type="dxa"/>
             <w:vAlign w:val="center"/>
           </w:tcPr>
           <w:p>
@@ -1393,31 +1321,7 @@
         </w:tc>
         <w:tc>
           <w:tcPr>
-            <w:tcW w:w="1100" w:type="dxa"/>
-            <w:vAlign w:val="center"/>
-          </w:tcPr>
-          <w:p>
-            <w:pPr>
-              <w:spacing w:before="30" w:after="30" w:line="240" w:lineRule="auto"/>
-              <w:ind w:right="0"/>
-              <w:jc w:val="center"/>
-            </w:pPr>
-            <w:r>
-              <w:rPr>
-                <w:rFonts w:ascii="TH Sarabun New" w:hAnsi="TH Sarabun New" w:cs="TH Sarabun New"/>
-                <w:b/>
-                <w:bCs/>
-                <w:color w:val="1F9D57"/>
-                <w:sz w:val="28"/>
-                <w:szCs w:val="28"/>
-              </w:rPr>
-              <w:t xml:space="preserve">+</w:t>
-            </w:r>
-          </w:p>
-        </w:tc>
-        <w:tc>
-          <w:tcPr>
-            <w:tcW w:w="2500" w:type="dxa"/>
+            <w:tcW w:w="2600" w:type="dxa"/>
             <w:vAlign w:val="center"/>
           </w:tcPr>
           <w:p>
@@ -1449,7 +1353,7 @@
       <w:tr>
         <w:tc>
           <w:tcPr>
-            <w:tcW w:w="5850" w:type="dxa"/>
+            <w:tcW w:w="6900" w:type="dxa"/>
             <w:vAlign w:val="center"/>
           </w:tcPr>
           <w:p>
@@ -1465,15 +1369,8 @@
                 <w:szCs w:val="28"/>
                 <w:cs/>
               </w:rPr>
-              <w:t xml:space="preserve">(C) เงินที่มหาวิทยาลัยหรือหน่วยงานภายนอกสนับสนุน</w:t>
+              <w:t xml:space="preserve">(C) เงินที่มหาวิทยาลัยหรือหน่วยงานภายนอกสนับสนุน </w:t>
             </w:r>
-          </w:p>
-          <w:p>
-            <w:pPr>
-              <w:spacing w:before="30" w:after="30" w:line="240" w:lineRule="auto"/>
-              <w:ind w:right="0"/>
-              <w:jc w:val="left"/>
-            </w:pPr>
             <w:r>
               <w:rPr>
                 <w:rFonts w:ascii="TH Sarabun New" w:hAnsi="TH Sarabun New" w:cs="TH Sarabun New"/>
@@ -1486,31 +1383,7 @@
         </w:tc>
         <w:tc>
           <w:tcPr>
-            <w:tcW w:w="1100" w:type="dxa"/>
-            <w:vAlign w:val="center"/>
-          </w:tcPr>
-          <w:p>
-            <w:pPr>
-              <w:spacing w:before="30" w:after="30" w:line="240" w:lineRule="auto"/>
-              <w:ind w:right="0"/>
-              <w:jc w:val="center"/>
-            </w:pPr>
-            <w:r>
-              <w:rPr>
-                <w:rFonts w:ascii="TH Sarabun New" w:hAnsi="TH Sarabun New" w:cs="TH Sarabun New"/>
-                <w:b/>
-                <w:bCs/>
-                <w:color w:val="C0392B"/>
-                <w:sz w:val="28"/>
-                <w:szCs w:val="28"/>
-              </w:rPr>
-              <w:t xml:space="preserve">-</w:t>
-            </w:r>
-          </w:p>
-        </w:tc>
-        <w:tc>
-          <w:tcPr>
-            <w:tcW w:w="2500" w:type="dxa"/>
+            <w:tcW w:w="2600" w:type="dxa"/>
             <w:vAlign w:val="center"/>
           </w:tcPr>
           <w:p>
@@ -1544,7 +1417,7 @@
       <w:tr>
         <w:tc>
           <w:tcPr>
-            <w:tcW w:w="5850" w:type="dxa"/>
+            <w:tcW w:w="6900" w:type="dxa"/>
             <w:shd w:val="clear" w:color="auto" w:fill="F2F2F2"/>
             <w:vAlign w:val="center"/>
           </w:tcPr>
@@ -1569,21 +1442,7 @@
         </w:tc>
         <w:tc>
           <w:tcPr>
-            <w:tcW w:w="1100" w:type="dxa"/>
-            <w:shd w:val="clear" w:color="auto" w:fill="F2F2F2"/>
-            <w:vAlign w:val="center"/>
-          </w:tcPr>
-          <w:p>
-            <w:pPr>
-              <w:spacing w:before="30" w:after="30" w:line="240" w:lineRule="auto"/>
-              <w:ind w:right="0"/>
-              <w:jc w:val="center"/>
-            </w:pPr>
-          </w:p>
-        </w:tc>
-        <w:tc>
-          <w:tcPr>
-            <w:tcW w:w="2500" w:type="dxa"/>
+            <w:tcW w:w="2600" w:type="dxa"/>
             <w:shd w:val="clear" w:color="auto" w:fill="F2F2F2"/>
             <w:vAlign w:val="center"/>
           </w:tcPr>
@@ -1620,7 +1479,7 @@
       <w:tr>
         <w:tc>
           <w:tcPr>
-            <w:tcW w:w="5850" w:type="dxa"/>
+            <w:tcW w:w="6900" w:type="dxa"/>
             <w:vAlign w:val="center"/>
           </w:tcPr>
           <w:p>
@@ -1645,20 +1504,7 @@
         </w:tc>
         <w:tc>
           <w:tcPr>
-            <w:tcW w:w="1100" w:type="dxa"/>
-            <w:vAlign w:val="center"/>
-          </w:tcPr>
-          <w:p>
-            <w:pPr>
-              <w:spacing w:before="30" w:after="30" w:line="240" w:lineRule="auto"/>
-              <w:ind w:right="0"/>
-              <w:jc w:val="center"/>
-            </w:pPr>
-          </w:p>
-        </w:tc>
-        <w:tc>
-          <w:tcPr>
-            <w:tcW w:w="2500" w:type="dxa"/>
+            <w:tcW w:w="2600" w:type="dxa"/>
             <w:vAlign w:val="center"/>
           </w:tcPr>
           <w:p>

</xml_diff>

<commit_message>
feat(publication-reward): meeting revisions + docs
Template/label changes from the review meeting:
- heading -> 'รายการการขอเบิก/จ่าย'
- reward row -> 'เงินรางวัล {{quartile}}' (new {{quartile}} short code, e.g. Q1)
- (C) row prefixed with 'หัก' and indented one level
- drop '(Top-up fund)' from the net top-up label
- thicker separators under the reward row and above/below the total row

Backend: add {{quartile}} to both preview paths via buildQuartileLabel().
Test: cover {{quartile}} in sample replacements.
Docs: add docs/publication-reward-preview.md explaining the whole pipeline
for future dev/AI work (entry points, fill/convert, placeholders, editing,
testing, fragilities).
</commit_message>
<xml_diff>
--- a/templates/publication_reward_template_new.docx
+++ b/templates/publication_reward_template_new.docx
@@ -1115,7 +1115,7 @@
           <w:szCs w:val="28"/>
           <w:cs/>
         </w:rPr>
-        <w:t xml:space="preserve">ค่าปรับปรุงบทความ ค่าธรรมเนียมการตีพิมพ์ และเงินสนับสนุนจากภายนอก</w:t>
+        <w:t xml:space="preserve">รายการการขอเบิก/จ่าย</w:t>
       </w:r>
     </w:p>
     <w:tbl>
@@ -1124,7 +1124,7 @@
         <w:jc w:val="center"/>
         <w:tblBorders>
           <w:top w:val="single" w:sz="8" w:space="0" w:color="000000"/>
-          <w:bottom w:val="single" w:sz="8" w:space="0" w:color="000000"/>
+          <w:bottom w:val="single" w:sz="16" w:space="0" w:color="000000"/>
           <w:insideH w:val="single" w:sz="4" w:space="0" w:color="BFBFBF"/>
         </w:tblBorders>
         <w:tblCellMar>
@@ -1192,6 +1192,9 @@
         <w:tc>
           <w:tcPr>
             <w:tcW w:w="6900" w:type="dxa"/>
+            <w:tcBorders>
+              <w:bottom w:val="single" w:sz="16" w:space="0" w:color="000000"/>
+            </w:tcBorders>
             <w:vAlign w:val="center"/>
           </w:tcPr>
           <w:p>
@@ -1207,13 +1210,24 @@
                 <w:szCs w:val="28"/>
                 <w:cs/>
               </w:rPr>
-              <w:t xml:space="preserve">เงินรางวัลที่ขอ (Requested Reward Amount)</w:t>
+              <w:t xml:space="preserve">เงินรางวัล </w:t>
+            </w:r>
+            <w:r>
+              <w:rPr>
+                <w:rFonts w:ascii="TH Sarabun New" w:hAnsi="TH Sarabun New" w:cs="TH Sarabun New"/>
+                <w:sz w:val="28"/>
+                <w:szCs w:val="28"/>
+              </w:rPr>
+              <w:t xml:space="preserve">{{quartile}}</w:t>
             </w:r>
           </w:p>
         </w:tc>
         <w:tc>
           <w:tcPr>
             <w:tcW w:w="2600" w:type="dxa"/>
+            <w:tcBorders>
+              <w:bottom w:val="single" w:sz="16" w:space="0" w:color="000000"/>
+            </w:tcBorders>
             <w:vAlign w:val="center"/>
           </w:tcPr>
           <w:p>
@@ -1359,7 +1373,7 @@
           <w:p>
             <w:pPr>
               <w:spacing w:before="30" w:after="30" w:line="240" w:lineRule="auto"/>
-              <w:ind w:right="0"/>
+              <w:ind w:left="480"/>
               <w:jc w:val="left"/>
             </w:pPr>
             <w:r>
@@ -1369,7 +1383,7 @@
                 <w:szCs w:val="28"/>
                 <w:cs/>
               </w:rPr>
-              <w:t xml:space="preserve">(C) เงินที่มหาวิทยาลัยหรือหน่วยงานภายนอกสนับสนุน </w:t>
+              <w:t xml:space="preserve">หัก (C) เงินที่มหาวิทยาลัยหรือหน่วยงานภายนอกสนับสนุน </w:t>
             </w:r>
             <w:r>
               <w:rPr>
@@ -1436,7 +1450,7 @@
                 <w:szCs w:val="28"/>
                 <w:cs/>
               </w:rPr>
-              <w:t xml:space="preserve">เงินสมทบที่ขอเบิก (A + B - C) (Top-up fund)</w:t>
+              <w:t xml:space="preserve">เงินสมทบที่ขอเบิก (A + B - C)</w:t>
             </w:r>
           </w:p>
         </w:tc>
@@ -1480,6 +1494,10 @@
         <w:tc>
           <w:tcPr>
             <w:tcW w:w="6900" w:type="dxa"/>
+            <w:tcBorders>
+              <w:top w:val="single" w:sz="16" w:space="0" w:color="000000"/>
+              <w:bottom w:val="single" w:sz="16" w:space="0" w:color="000000"/>
+            </w:tcBorders>
             <w:vAlign w:val="center"/>
           </w:tcPr>
           <w:p>
@@ -1505,6 +1523,10 @@
         <w:tc>
           <w:tcPr>
             <w:tcW w:w="2600" w:type="dxa"/>
+            <w:tcBorders>
+              <w:top w:val="single" w:sz="16" w:space="0" w:color="000000"/>
+              <w:bottom w:val="single" w:sz="16" w:space="0" w:color="000000"/>
+            </w:tcBorders>
             <w:vAlign w:val="center"/>
           </w:tcPr>
           <w:p>

</xml_diff>

<commit_message>
fix(publication-reward): external funds start on a new line in (C)
After dropping the +/- column the (C) label and the inlined external fund list
shared one paragraph, so the first fund ran onto the label line. Introduce
{{external_fund_block}} (backend prepends a newline only when funds exist, else
empty) so each fund starts on its own line under the label while the no-external
case still stays a single line with no dangling blank.
</commit_message>
<xml_diff>
--- a/templates/publication_reward_template_new.docx
+++ b/templates/publication_reward_template_new.docx
@@ -1383,7 +1383,7 @@
                 <w:szCs w:val="28"/>
                 <w:cs/>
               </w:rPr>
-              <w:t xml:space="preserve">หัก (C) เงินที่มหาวิทยาลัยหรือหน่วยงานภายนอกสนับสนุน </w:t>
+              <w:t xml:space="preserve">หัก (C) เงินที่มหาวิทยาลัยหรือหน่วยงานภายนอกสนับสนุน</w:t>
             </w:r>
             <w:r>
               <w:rPr>
@@ -1391,7 +1391,7 @@
                 <w:sz w:val="28"/>
                 <w:szCs w:val="28"/>
               </w:rPr>
-              <w:t xml:space="preserve">{{external_fund_list}}</w:t>
+              <w:t xml:space="preserve">{{external_fund_block}}</w:t>
             </w:r>
           </w:p>
         </w:tc>

</xml_diff>

<commit_message>
feat(publication-reward): show 'เคยขอเงินรางวัลแล้ว' note when reward is 0
When the applicant already received the reward, the server sets reward = 0.00. Add
{{reward_received_note}} (buildRewardReceivedNote) appended after {{quartile}} in the
reward-row label so it reads 'เงินรางวัล Q1 (เคยขอเงินรางวัลแล้ว)' and the zero is
explained. Empty in the normal case. Set in both preview paths; template updated;
regression test TestNewTemplate_RewardReceivedNote added.
</commit_message>
<xml_diff>
--- a/templates/publication_reward_template_new.docx
+++ b/templates/publication_reward_template_new.docx
@@ -1220,6 +1220,15 @@
                 <w:szCs w:val="28"/>
               </w:rPr>
               <w:t xml:space="preserve">{{quartile}}</w:t>
+            </w:r>
+            <w:r>
+              <w:rPr>
+                <w:rFonts w:ascii="TH Sarabun New" w:hAnsi="TH Sarabun New" w:cs="TH Sarabun New" w:hint="cs"/>
+                <w:sz w:val="28"/>
+                <w:szCs w:val="28"/>
+                <w:cs/>
+              </w:rPr>
+              <w:t xml:space="preserve">{{reward_received_note}}</w:t>
             </w:r>
           </w:p>
         </w:tc>

</xml_diff>